<commit_message>
Dodaj poradnik i plan postepowania w sprawie torbieli
</commit_message>
<xml_diff>
--- a/dist/wniosek-dokumentacja-papierowa.docx
+++ b/dist/wniosek-dokumentacja-papierowa.docx
@@ -1,6 +1,6 @@
 
 <file path=word/document.xml><?xml version="1.0" encoding="utf-8"?>
-<w:document xmlns:o="urn:schemas-microsoft-com:office:office" xmlns:r="http://schemas.openxmlformats.org/officeDocument/2006/relationships" xmlns:v="urn:schemas-microsoft-com:vml" xmlns:w="http://schemas.openxmlformats.org/wordprocessingml/2006/main" xmlns:w10="urn:schemas-microsoft-com:office:word" xmlns:wp="http://schemas.openxmlformats.org/drawingml/2006/wordprocessingDrawing" xmlns:wps="http://schemas.microsoft.com/office/word/2010/wordprocessingShape" xmlns:wpg="http://schemas.microsoft.com/office/word/2010/wordprocessingGroup" xmlns:mc="http://schemas.openxmlformats.org/markup-compatibility/2006" xmlns:wp14="http://schemas.microsoft.com/office/word/2010/wordprocessingDrawing" xmlns:w14="http://schemas.microsoft.com/office/word/2010/wordml" xmlns:w15="http://schemas.microsoft.com/office/word/2012/wordml" mc:Ignorable="w14 wp14 w15">
+<w:document xmlns:o="urn:schemas-microsoft-com:office:office" xmlns:r="http://schemas.openxmlformats.org/officeDocument/2006/relationships" xmlns:v="urn:schemas-microsoft-com:vml" xmlns:w="http://schemas.openxmlformats.org/wordprocessingml/2006/main" xmlns:w10="urn:schemas-microsoft-com:office:word" xmlns:wp="http://schemas.openxmlformats.org/drawingml/2006/wordprocessingDrawing" xmlns:pic="http://schemas.openxmlformats.org/drawingml/2006/picture" xmlns:wps="http://schemas.microsoft.com/office/word/2010/wordprocessingShape" xmlns:wpg="http://schemas.microsoft.com/office/word/2010/wordprocessingGroup" xmlns:mc="http://schemas.openxmlformats.org/markup-compatibility/2006" xmlns:wp14="http://schemas.microsoft.com/office/word/2010/wordprocessingDrawing" xmlns:w14="http://schemas.microsoft.com/office/word/2010/wordml" xmlns:w15="http://schemas.microsoft.com/office/word/2012/wordml" mc:Ignorable="w14 wp14 w15">
   <w:body>
     <w:p>
       <w:pPr>
@@ -452,17 +452,7 @@
       </w:r>
       <w:r>
         <w:rPr/>
-        <w:t xml:space="preserve"> (Dz.U. z 2023 r. poz. 991 ze zm.), wnoszę o podanie bez zbędnej zwłoki, nie później niż w terminie 7 dni od dnia otrzymania niniejszego wniosku </w:t>
-      </w:r>
-      <w:r>
-        <w:rPr>
-          <w:rStyle w:val="Emphasis"/>
-        </w:rPr>
-        <w:t>(ustawa nie wyznacza terminu ustawowego — termin 7-dniowy wyznaczam jako rozsądny)</w:t>
-      </w:r>
-      <w:r>
-        <w:rPr/>
-        <w:t>:</w:t>
+        <w:t xml:space="preserve"> (t.j. Dz.U. z 2026 r. poz. 156), wnoszę o podanie informacji o umowie ubezpieczenia OC obejmującej okres udzielania mi świadczeń, w szczególności:</w:t>
       </w:r>
     </w:p>
     <w:p>
@@ -483,7 +473,7 @@
       </w:pPr>
       <w:r>
         <w:rPr/>
-        <w:t xml:space="preserve">Dokładnej nazwy i adresu zakładu ubezpieczeń, w którym podmiot leczniczy / lekarz prowadzący posiadał zawartą umowę obowiązkowego ubezpieczenia odpowiedzialności cywilnej (OC) w dacie ........................ r. (okres udzielania świadczeń); </w:t>
+        <w:t xml:space="preserve">Nazwy zakładu ubezpieczeń; </w:t>
       </w:r>
     </w:p>
     <w:p>
@@ -504,7 +494,7 @@
       </w:pPr>
       <w:r>
         <w:rPr/>
-        <w:t xml:space="preserve">Serii i numeru polisy ubezpieczeniowej OC; </w:t>
+        <w:t xml:space="preserve">Numeru polisy oraz okresu ubezpieczenia; </w:t>
       </w:r>
     </w:p>
     <w:p>
@@ -524,7 +514,18 @@
       </w:pPr>
       <w:r>
         <w:rPr/>
-        <w:t xml:space="preserve">Sumy gwarancyjnej polisy. </w:t>
+        <w:t xml:space="preserve">Sumy gwarancyjnej i — jeśli dotyczy — danych podmiotu lub praktyki objętej ochroną. </w:t>
+      </w:r>
+    </w:p>
+    <w:p>
+      <w:pPr>
+        <w:pStyle w:val="BodyText"/>
+        <w:bidi w:val="0"/>
+        <w:rPr/>
+      </w:pPr>
+      <w:r>
+        <w:rPr/>
+        <w:t>Proszę o odpowiedź bez zbędnej zwłoki. Jeżeli wyznaczam termin 7 dni od otrzymania wniosku, jest to termin proponowany przeze mnie, a nie termin określony w ustawie.</w:t>
       </w:r>
     </w:p>
     <w:p>
@@ -603,7 +604,6 @@
       <w:pPr>
         <w:pStyle w:val="BodyText"/>
         <w:bidi w:val="0"/>
-        <w:spacing w:before="90" w:after="90"/>
         <w:rPr/>
       </w:pPr>
       <w:r>
@@ -612,35 +612,89 @@
         </w:rPr>
         <w:t>Wskazówki:</w:t>
       </w:r>
-      <w:r>
-        <w:rPr/>
-        <w:br/>
-      </w:r>
-      <w:r>
-        <w:rPr>
-          <w:rStyle w:val="Emphasis"/>
-        </w:rPr>
-        <w:t>1. Pismo należy złożyć w 2 egzemplarzach w rejestracji podmiotu (jeden egzemplarz z pieczątką i datą wpływu zachować dla siebie) lub nadać listem poleconym ze zwrotnym potwierdzeniem odbioru (ZPO).</w:t>
-      </w:r>
-      <w:r>
-        <w:rPr/>
-        <w:br/>
-      </w:r>
-      <w:r>
-        <w:rPr>
-          <w:rStyle w:val="Emphasis"/>
-        </w:rPr>
-        <w:t>2. Pierwsza kopia dokumentacji medycznej jest w pełni bezpłatna.</w:t>
-      </w:r>
-      <w:r>
-        <w:rPr/>
-        <w:br/>
-      </w:r>
-      <w:r>
-        <w:rPr>
-          <w:rStyle w:val="Emphasis"/>
-        </w:rPr>
-        <w:t>3. W sprawach o nawrót / kontrolę po zabiegu złóż DWA osobne wnioski: (a) do gabinetu spornego (sprawcy) — pełna historia + sporne CBCT/DICOM + dane polisy OC; (b) do gabinetu weryfikującego — opis ropnia/nacięcia, recepta, własne CBCT/DICOM, plan i kosztorys leczenia naprawczego oraz pisemne porównanie spornego CBCT z własnym CBCT. Wniosek (b) składasz bez żądania polisy OC.</w:t>
+    </w:p>
+    <w:p>
+      <w:pPr>
+        <w:pStyle w:val="BodyText"/>
+        <w:numPr>
+          <w:ilvl w:val="0"/>
+          <w:numId w:val="3"/>
+        </w:numPr>
+        <w:tabs>
+          <w:tab w:val="clear" w:pos="1134"/>
+          <w:tab w:val="left" w:pos="709" w:leader="none"/>
+        </w:tabs>
+        <w:bidi w:val="0"/>
+        <w:spacing w:before="90" w:after="0"/>
+        <w:ind w:hanging="283" w:start="709"/>
+        <w:rPr/>
+      </w:pPr>
+      <w:r>
+        <w:rPr/>
+        <w:t xml:space="preserve">Pismo można złożyć osobiście z potwierdzeniem wpływu na kopii albo wysłać w sposób pozwalający zachować dowód doręczenia. </w:t>
+      </w:r>
+    </w:p>
+    <w:p>
+      <w:pPr>
+        <w:pStyle w:val="BodyText"/>
+        <w:numPr>
+          <w:ilvl w:val="0"/>
+          <w:numId w:val="3"/>
+        </w:numPr>
+        <w:tabs>
+          <w:tab w:val="clear" w:pos="1134"/>
+          <w:tab w:val="left" w:pos="709" w:leader="none"/>
+        </w:tabs>
+        <w:bidi w:val="0"/>
+        <w:spacing w:before="90" w:after="0"/>
+        <w:ind w:hanging="283" w:start="709"/>
+        <w:rPr/>
+      </w:pPr>
+      <w:r>
+        <w:rPr/>
+        <w:t xml:space="preserve">Pierwsze udostępnienie dokumentacji w żądanym zakresie i w formach wskazanych w art. 28 ust. 2a ustawy o prawach pacjenta jest bezpłatne. Dokumentację udostępnia się bez zbędnej zwłoki; ustawa nie ustanawia ogólnego terminu 14 dni roboczych. </w:t>
+      </w:r>
+    </w:p>
+    <w:p>
+      <w:pPr>
+        <w:pStyle w:val="BodyText"/>
+        <w:numPr>
+          <w:ilvl w:val="0"/>
+          <w:numId w:val="3"/>
+        </w:numPr>
+        <w:tabs>
+          <w:tab w:val="clear" w:pos="1134"/>
+          <w:tab w:val="left" w:pos="709" w:leader="none"/>
+        </w:tabs>
+        <w:bidi w:val="0"/>
+        <w:spacing w:before="90" w:after="0"/>
+        <w:ind w:hanging="283" w:start="709"/>
+        <w:rPr/>
+      </w:pPr>
+      <w:r>
+        <w:rPr/>
+        <w:t xml:space="preserve">W tej sprawie złóż osobny wniosek do Gabinetu nr 1 o dokumentację z leczenia i kontroli, zwłaszcza wpis i CBCT z 04.08.2026, oraz osobny wniosek do Gabinetu nr 2 o dokumentację z 25.09.2026, CBCT, receptę, opis wykonanej procedury, plan leczenia i kosztorys. </w:t>
+      </w:r>
+    </w:p>
+    <w:p>
+      <w:pPr>
+        <w:pStyle w:val="BodyText"/>
+        <w:numPr>
+          <w:ilvl w:val="0"/>
+          <w:numId w:val="3"/>
+        </w:numPr>
+        <w:tabs>
+          <w:tab w:val="clear" w:pos="1134"/>
+          <w:tab w:val="left" w:pos="709" w:leader="none"/>
+        </w:tabs>
+        <w:bidi w:val="0"/>
+        <w:spacing w:before="90" w:after="90"/>
+        <w:ind w:hanging="283" w:start="709"/>
+        <w:rPr/>
+      </w:pPr>
+      <w:r>
+        <w:rPr/>
+        <w:t xml:space="preserve">Wniosek o dokumentację dotyczy materiałów już prowadzonych lub posiadanych przez gabinet. Prośbę o nową opinię porównującą badania złóż osobno; może być odrębną konsultacją, także odpłatną. </w:t>
       </w:r>
     </w:p>
     <w:sectPr>
@@ -899,9 +953,128 @@
   <w:abstractNum w:abstractNumId="3">
     <w:lvl w:ilvl="0">
       <w:start w:val="1"/>
+      <w:numFmt w:val="decimal"/>
+      <w:lvlText w:val="%1."/>
+      <w:lvlJc w:val="start"/>
+      <w:pPr>
+        <w:tabs>
+          <w:tab w:val="num" w:pos="709"/>
+        </w:tabs>
+        <w:ind w:start="709" w:hanging="283"/>
+      </w:pPr>
+      <w:rPr/>
+    </w:lvl>
+    <w:lvl w:ilvl="1">
+      <w:start w:val="1"/>
+      <w:numFmt w:val="decimal"/>
+      <w:lvlText w:val="%2."/>
+      <w:lvlJc w:val="start"/>
+      <w:pPr>
+        <w:tabs>
+          <w:tab w:val="num" w:pos="1418"/>
+        </w:tabs>
+        <w:ind w:start="1418" w:hanging="283"/>
+      </w:pPr>
+      <w:rPr/>
+    </w:lvl>
+    <w:lvl w:ilvl="2">
+      <w:start w:val="1"/>
+      <w:numFmt w:val="decimal"/>
+      <w:lvlText w:val="%3."/>
+      <w:lvlJc w:val="start"/>
+      <w:pPr>
+        <w:tabs>
+          <w:tab w:val="num" w:pos="2127"/>
+        </w:tabs>
+        <w:ind w:start="2127" w:hanging="283"/>
+      </w:pPr>
+      <w:rPr/>
+    </w:lvl>
+    <w:lvl w:ilvl="3">
+      <w:start w:val="1"/>
+      <w:numFmt w:val="decimal"/>
+      <w:lvlText w:val="%4."/>
+      <w:lvlJc w:val="start"/>
+      <w:pPr>
+        <w:tabs>
+          <w:tab w:val="num" w:pos="2836"/>
+        </w:tabs>
+        <w:ind w:start="2836" w:hanging="283"/>
+      </w:pPr>
+      <w:rPr/>
+    </w:lvl>
+    <w:lvl w:ilvl="4">
+      <w:start w:val="1"/>
+      <w:numFmt w:val="decimal"/>
+      <w:lvlText w:val="%5."/>
+      <w:lvlJc w:val="start"/>
+      <w:pPr>
+        <w:tabs>
+          <w:tab w:val="num" w:pos="3545"/>
+        </w:tabs>
+        <w:ind w:start="3545" w:hanging="283"/>
+      </w:pPr>
+      <w:rPr/>
+    </w:lvl>
+    <w:lvl w:ilvl="5">
+      <w:start w:val="1"/>
+      <w:numFmt w:val="decimal"/>
+      <w:lvlText w:val="%6."/>
+      <w:lvlJc w:val="start"/>
+      <w:pPr>
+        <w:tabs>
+          <w:tab w:val="num" w:pos="4254"/>
+        </w:tabs>
+        <w:ind w:start="4254" w:hanging="283"/>
+      </w:pPr>
+      <w:rPr/>
+    </w:lvl>
+    <w:lvl w:ilvl="6">
+      <w:start w:val="1"/>
+      <w:numFmt w:val="decimal"/>
+      <w:lvlText w:val="%7."/>
+      <w:lvlJc w:val="start"/>
+      <w:pPr>
+        <w:tabs>
+          <w:tab w:val="num" w:pos="4963"/>
+        </w:tabs>
+        <w:ind w:start="4963" w:hanging="283"/>
+      </w:pPr>
+      <w:rPr/>
+    </w:lvl>
+    <w:lvl w:ilvl="7">
+      <w:start w:val="1"/>
+      <w:numFmt w:val="decimal"/>
+      <w:lvlText w:val="%8."/>
+      <w:lvlJc w:val="start"/>
+      <w:pPr>
+        <w:tabs>
+          <w:tab w:val="num" w:pos="5672"/>
+        </w:tabs>
+        <w:ind w:start="5672" w:hanging="283"/>
+      </w:pPr>
+      <w:rPr/>
+    </w:lvl>
+    <w:lvl w:ilvl="8">
+      <w:start w:val="1"/>
+      <w:numFmt w:val="decimal"/>
+      <w:lvlText w:val="%9."/>
+      <w:lvlJc w:val="start"/>
+      <w:pPr>
+        <w:tabs>
+          <w:tab w:val="num" w:pos="6381"/>
+        </w:tabs>
+        <w:ind w:start="6381" w:hanging="283"/>
+      </w:pPr>
+      <w:rPr/>
+    </w:lvl>
+  </w:abstractNum>
+  <w:abstractNum w:abstractNumId="4">
+    <w:lvl w:ilvl="0">
+      <w:start w:val="1"/>
       <w:numFmt w:val="none"/>
       <w:suff w:val="nothing"/>
-      <w:lvlText w:val="%1"/>
+      <w:lvlText w:val=""/>
       <w:lvlJc w:val="start"/>
       <w:pPr>
         <w:tabs>
@@ -912,10 +1085,37 @@
     </w:lvl>
     <w:lvl w:ilvl="1">
       <w:start w:val="1"/>
+      <w:numFmt w:val="none"/>
       <w:pStyle w:val="Heading2"/>
+      <w:suff w:val="nothing"/>
+      <w:lvlText w:val=""/>
+      <w:lvlJc w:val="start"/>
+      <w:pPr>
+        <w:tabs>
+          <w:tab w:val="num" w:pos="0"/>
+        </w:tabs>
+        <w:ind w:start="0" w:hanging="0"/>
+      </w:pPr>
+    </w:lvl>
+    <w:lvl w:ilvl="2">
+      <w:start w:val="1"/>
+      <w:numFmt w:val="none"/>
+      <w:pStyle w:val="Heading3"/>
+      <w:suff w:val="nothing"/>
+      <w:lvlText w:val=""/>
+      <w:lvlJc w:val="start"/>
+      <w:pPr>
+        <w:tabs>
+          <w:tab w:val="num" w:pos="0"/>
+        </w:tabs>
+        <w:ind w:start="0" w:hanging="0"/>
+      </w:pPr>
+    </w:lvl>
+    <w:lvl w:ilvl="3">
+      <w:start w:val="1"/>
       <w:numFmt w:val="none"/>
       <w:suff w:val="nothing"/>
-      <w:lvlText w:val="%2"/>
+      <w:lvlText w:val=""/>
       <w:lvlJc w:val="start"/>
       <w:pPr>
         <w:tabs>
@@ -924,12 +1124,11 @@
         <w:ind w:start="0" w:hanging="0"/>
       </w:pPr>
     </w:lvl>
-    <w:lvl w:ilvl="2">
-      <w:start w:val="1"/>
-      <w:pStyle w:val="Heading3"/>
+    <w:lvl w:ilvl="4">
+      <w:start w:val="1"/>
       <w:numFmt w:val="none"/>
       <w:suff w:val="nothing"/>
-      <w:lvlText w:val="%3"/>
+      <w:lvlText w:val=""/>
       <w:lvlJc w:val="start"/>
       <w:pPr>
         <w:tabs>
@@ -938,11 +1137,11 @@
         <w:ind w:start="0" w:hanging="0"/>
       </w:pPr>
     </w:lvl>
-    <w:lvl w:ilvl="3">
+    <w:lvl w:ilvl="5">
       <w:start w:val="1"/>
       <w:numFmt w:val="none"/>
       <w:suff w:val="nothing"/>
-      <w:lvlText w:val="%4"/>
+      <w:lvlText w:val=""/>
       <w:lvlJc w:val="start"/>
       <w:pPr>
         <w:tabs>
@@ -951,11 +1150,11 @@
         <w:ind w:start="0" w:hanging="0"/>
       </w:pPr>
     </w:lvl>
-    <w:lvl w:ilvl="4">
+    <w:lvl w:ilvl="6">
       <w:start w:val="1"/>
       <w:numFmt w:val="none"/>
       <w:suff w:val="nothing"/>
-      <w:lvlText w:val="%5"/>
+      <w:lvlText w:val=""/>
       <w:lvlJc w:val="start"/>
       <w:pPr>
         <w:tabs>
@@ -964,11 +1163,11 @@
         <w:ind w:start="0" w:hanging="0"/>
       </w:pPr>
     </w:lvl>
-    <w:lvl w:ilvl="5">
+    <w:lvl w:ilvl="7">
       <w:start w:val="1"/>
       <w:numFmt w:val="none"/>
       <w:suff w:val="nothing"/>
-      <w:lvlText w:val="%6"/>
+      <w:lvlText w:val=""/>
       <w:lvlJc w:val="start"/>
       <w:pPr>
         <w:tabs>
@@ -977,37 +1176,11 @@
         <w:ind w:start="0" w:hanging="0"/>
       </w:pPr>
     </w:lvl>
-    <w:lvl w:ilvl="6">
+    <w:lvl w:ilvl="8">
       <w:start w:val="1"/>
       <w:numFmt w:val="none"/>
       <w:suff w:val="nothing"/>
-      <w:lvlText w:val="%7"/>
-      <w:lvlJc w:val="start"/>
-      <w:pPr>
-        <w:tabs>
-          <w:tab w:val="num" w:pos="0"/>
-        </w:tabs>
-        <w:ind w:start="0" w:hanging="0"/>
-      </w:pPr>
-    </w:lvl>
-    <w:lvl w:ilvl="7">
-      <w:start w:val="1"/>
-      <w:numFmt w:val="none"/>
-      <w:suff w:val="nothing"/>
-      <w:lvlText w:val="%8"/>
-      <w:lvlJc w:val="start"/>
-      <w:pPr>
-        <w:tabs>
-          <w:tab w:val="num" w:pos="0"/>
-        </w:tabs>
-        <w:ind w:start="0" w:hanging="0"/>
-      </w:pPr>
-    </w:lvl>
-    <w:lvl w:ilvl="8">
-      <w:start w:val="1"/>
-      <w:numFmt w:val="none"/>
-      <w:suff w:val="nothing"/>
-      <w:lvlText w:val="%9"/>
+      <w:lvlText w:val=""/>
       <w:lvlJc w:val="start"/>
       <w:pPr>
         <w:tabs>
@@ -1026,6 +1199,9 @@
   <w:num w:numId="3">
     <w:abstractNumId w:val="3"/>
   </w:num>
+  <w:num w:numId="4">
+    <w:abstractNumId w:val="4"/>
+  </w:num>
 </w:numbering>
 </file>
 
@@ -1034,7 +1210,7 @@
   <w:docDefaults>
     <w:rPrDefault>
       <w:rPr>
-        <w:rFonts w:ascii="Liberation Serif" w:hAnsi="Liberation Serif" w:eastAsia="Noto Sans" w:cs="Noto Sans Devanagari"/>
+        <w:rFonts w:ascii="Liberation Serif" w:hAnsi="Liberation Serif" w:eastAsia="Noto Serif CJK SC" w:cs="Noto Sans Devanagari"/>
         <w:sz w:val="24"/>
         <w:szCs w:val="24"/>
         <w:lang w:val="en-US" w:eastAsia="zh-CN" w:bidi="hi-IN"/>
@@ -1063,7 +1239,7 @@
     </w:rPr>
   </w:style>
   <w:style w:type="paragraph" w:styleId="Heading1">
-    <w:name w:val="Heading 1"/>
+    <w:name w:val="heading 1"/>
     <w:basedOn w:val="Heading"/>
     <w:next w:val="BodyText"/>
     <w:qFormat/>
@@ -1075,7 +1251,6 @@
       <w:jc w:val="center"/>
     </w:pPr>
     <w:rPr>
-      <w:rFonts w:ascii="Noto Sans" w:hAnsi="Noto Sans"/>
       <w:b/>
       <w:bCs/>
       <w:caps/>
@@ -1084,7 +1259,7 @@
     </w:rPr>
   </w:style>
   <w:style w:type="paragraph" w:styleId="Heading2">
-    <w:name w:val="Heading 2"/>
+    <w:name w:val="heading 2"/>
     <w:basedOn w:val="Heading"/>
     <w:next w:val="BodyText"/>
     <w:qFormat/>
@@ -1097,7 +1272,7 @@
       <w:outlineLvl w:val="1"/>
     </w:pPr>
     <w:rPr>
-      <w:rFonts w:ascii="Liberation Serif" w:hAnsi="Liberation Serif" w:eastAsia="Noto Sans" w:cs="Noto Sans Devanagari"/>
+      <w:rFonts w:ascii="Liberation Serif" w:hAnsi="Liberation Serif" w:eastAsia="Noto Serif CJK SC" w:cs="Noto Sans Devanagari"/>
       <w:b/>
       <w:bCs/>
       <w:sz w:val="24"/>
@@ -1105,7 +1280,7 @@
     </w:rPr>
   </w:style>
   <w:style w:type="paragraph" w:styleId="Heading3">
-    <w:name w:val="Heading 3"/>
+    <w:name w:val="heading 3"/>
     <w:basedOn w:val="Heading"/>
     <w:next w:val="BodyText"/>
     <w:qFormat/>
@@ -1115,11 +1290,23 @@
       <w:outlineLvl w:val="2"/>
     </w:pPr>
     <w:rPr>
-      <w:rFonts w:ascii="Liberation Serif" w:hAnsi="Liberation Serif" w:eastAsia="Noto Sans" w:cs="Noto Sans Devanagari"/>
+      <w:rFonts w:ascii="Liberation Serif" w:hAnsi="Liberation Serif" w:eastAsia="Noto Serif CJK SC" w:cs="Noto Sans Devanagari"/>
       <w:b/>
       <w:bCs/>
       <w:sz w:val="22"/>
       <w:szCs w:val="22"/>
+    </w:rPr>
+  </w:style>
+  <w:style w:type="character" w:styleId="EndnoteReference">
+    <w:name w:val="endnote reference"/>
+    <w:rPr>
+      <w:vertAlign w:val="superscript"/>
+    </w:rPr>
+  </w:style>
+  <w:style w:type="character" w:styleId="FootnoteReference">
+    <w:name w:val="footnote reference"/>
+    <w:rPr>
+      <w:vertAlign w:val="superscript"/>
     </w:rPr>
   </w:style>
   <w:style w:type="character" w:styleId="EndnoteCharacters">
@@ -1178,7 +1365,7 @@
     </w:rPr>
   </w:style>
   <w:style w:type="paragraph" w:styleId="EnvelopeReturn">
-    <w:name w:val="Envelope Return"/>
+    <w:name w:val="envelope return"/>
     <w:basedOn w:val="Normal"/>
     <w:pPr/>
     <w:rPr>
@@ -1190,46 +1377,6 @@
     <w:basedOn w:val="BodyText"/>
     <w:qFormat/>
     <w:pPr/>
-    <w:rPr/>
-  </w:style>
-  <w:style w:type="paragraph" w:styleId="Footer">
-    <w:name w:val="Footer"/>
-    <w:basedOn w:val="Normal"/>
-    <w:pPr>
-      <w:suppressLineNumbers/>
-      <w:tabs>
-        <w:tab w:val="clear" w:pos="1134"/>
-        <w:tab w:val="center" w:pos="4818" w:leader="none"/>
-        <w:tab w:val="right" w:pos="9637" w:leader="none"/>
-      </w:tabs>
-    </w:pPr>
-    <w:rPr/>
-  </w:style>
-  <w:style w:type="paragraph" w:styleId="Header">
-    <w:name w:val="Header"/>
-    <w:basedOn w:val="Normal"/>
-    <w:pPr>
-      <w:suppressLineNumbers/>
-      <w:tabs>
-        <w:tab w:val="clear" w:pos="1134"/>
-        <w:tab w:val="center" w:pos="4818" w:leader="none"/>
-        <w:tab w:val="right" w:pos="9637" w:leader="none"/>
-      </w:tabs>
-    </w:pPr>
-    <w:rPr/>
-  </w:style>
-  <w:style w:type="paragraph" w:styleId="HeaderandFooter">
-    <w:name w:val="Header and Footer"/>
-    <w:basedOn w:val="Normal"/>
-    <w:qFormat/>
-    <w:pPr>
-      <w:suppressLineNumbers/>
-      <w:tabs>
-        <w:tab w:val="clear" w:pos="1134"/>
-        <w:tab w:val="center" w:pos="4819" w:leader="none"/>
-        <w:tab w:val="right" w:pos="9638" w:leader="none"/>
-      </w:tabs>
-    </w:pPr>
     <w:rPr/>
   </w:style>
   <w:style w:type="paragraph" w:styleId="Index">
@@ -1244,7 +1391,7 @@
     </w:rPr>
   </w:style>
   <w:style w:type="paragraph" w:styleId="Caption">
-    <w:name w:val="Caption"/>
+    <w:name w:val="caption"/>
     <w:basedOn w:val="Normal"/>
     <w:qFormat/>
     <w:pPr>
@@ -1302,37 +1449,37 @@
         <a:srgbClr val="000000"/>
       </a:dk1>
       <a:lt1>
-        <a:srgbClr val="ffffff"/>
+        <a:srgbClr val="FFFFFF"/>
       </a:lt1>
       <a:dk2>
         <a:srgbClr val="000000"/>
       </a:dk2>
       <a:lt2>
-        <a:srgbClr val="ffffff"/>
+        <a:srgbClr val="FFFFFF"/>
       </a:lt2>
       <a:accent1>
-        <a:srgbClr val="18a303"/>
+        <a:srgbClr val="18A303"/>
       </a:accent1>
       <a:accent2>
-        <a:srgbClr val="0369a3"/>
+        <a:srgbClr val="0369A3"/>
       </a:accent2>
       <a:accent3>
-        <a:srgbClr val="a33e03"/>
+        <a:srgbClr val="A33E03"/>
       </a:accent3>
       <a:accent4>
-        <a:srgbClr val="8e03a3"/>
+        <a:srgbClr val="8E03A3"/>
       </a:accent4>
       <a:accent5>
-        <a:srgbClr val="c99c00"/>
+        <a:srgbClr val="C99C00"/>
       </a:accent5>
       <a:accent6>
-        <a:srgbClr val="c9211e"/>
+        <a:srgbClr val="C9211E"/>
       </a:accent6>
       <a:hlink>
-        <a:srgbClr val="0000ee"/>
+        <a:srgbClr val="0000EE"/>
       </a:hlink>
       <a:folHlink>
-        <a:srgbClr val="551a8b"/>
+        <a:srgbClr val="551A8B"/>
       </a:folHlink>
     </a:clrScheme>
     <a:fontScheme name="Office">

</xml_diff>